<commit_message>
Adicionando as questão que faltava na terceira lista e fazendo a implementação desafio
</commit_message>
<xml_diff>
--- a/Primeira atividade do bimestre/Atividade 3/Lista de exercícios 03 .docx
+++ b/Primeira atividade do bimestre/Atividade 3/Lista de exercícios 03 .docx
@@ -1598,6 +1598,35 @@
           <w:szCs w:val="24"/>
           <w:rtl w:val="0"/>
         </w:rPr>
+        <w:t xml:space="preserve">Resposta: A AVL vai ser uma árvore binária de busca que tem como principal característica se organizar sozinha, ou seja, ela é auto-balanceada. Ela passa por uma verificação toda vez que você coloca ou tira um nó para ver se a altura de um lado não está muito maior que a do outro. Se a diferença de altura entre a esquerda e a direita passar de 1, ela faz um processo chamado rotação para arrumar os nós e deixar a árvore reta de novo, o que faz as buscas continuarem muito rápidas.</w:t>
+      </w:r>
+    </w:p>
+    <w:p>
+      <w:pPr>
+        <w:rPr>
+          <w:sz w:val="24"/>
+          <w:szCs w:val="24"/>
+        </w:rPr>
+      </w:pPr>
+      <w:r>
+        <w:rPr>
+          <w:rtl w:val="0"/>
+        </w:rPr>
+      </w:r>
+    </w:p>
+    <w:p>
+      <w:pPr>
+        <w:rPr>
+          <w:sz w:val="24"/>
+          <w:szCs w:val="24"/>
+        </w:rPr>
+      </w:pPr>
+      <w:r>
+        <w:rPr>
+          <w:sz w:val="24"/>
+          <w:szCs w:val="24"/>
+          <w:rtl w:val="0"/>
+        </w:rPr>
         <w:t xml:space="preserve">- O que é árvores Rubro-Negra?</w:t>
       </w:r>
     </w:p>
@@ -1614,6 +1643,35 @@
           <w:szCs w:val="24"/>
           <w:rtl w:val="0"/>
         </w:rPr>
+        <w:t xml:space="preserve">Resposta: É um outro tipo de árvore binária de busca que também se balanceia sozinha, mas em vez de ficar calculando a altura certinha dos nós, ela usa um esquema de cores onde cada nó vai ser pintado de vermelho (rubro) ou preto (negra). Ela tem umas regras fixas para essas cores, tipo a raiz tem que ser preta e um nó vermelho não pode ter filho vermelho. Isso serve para que nenhum caminho até as folhas fique muito maior que o outro, mantendo os dados equilibrados.</w:t>
+      </w:r>
+    </w:p>
+    <w:p>
+      <w:pPr>
+        <w:rPr>
+          <w:sz w:val="24"/>
+          <w:szCs w:val="24"/>
+        </w:rPr>
+      </w:pPr>
+      <w:r>
+        <w:rPr>
+          <w:rtl w:val="0"/>
+        </w:rPr>
+      </w:r>
+    </w:p>
+    <w:p>
+      <w:pPr>
+        <w:rPr>
+          <w:sz w:val="24"/>
+          <w:szCs w:val="24"/>
+        </w:rPr>
+      </w:pPr>
+      <w:r>
+        <w:rPr>
+          <w:sz w:val="24"/>
+          <w:szCs w:val="24"/>
+          <w:rtl w:val="0"/>
+        </w:rPr>
         <w:t xml:space="preserve">- O que são B-Tree?</w:t>
       </w:r>
     </w:p>
@@ -1626,8 +1684,11 @@
       </w:pPr>
       <w:r>
         <w:rPr>
-          <w:rtl w:val="0"/>
-        </w:rPr>
+          <w:sz w:val="24"/>
+          <w:szCs w:val="24"/>
+          <w:rtl w:val="0"/>
+        </w:rPr>
+        <w:t xml:space="preserve">Resposta: As árvores B já não são árvores binárias, porque elas guardam mais de um dado dentro do mesmo nó e também podem ter muito mais de dois filhos saindo de um pai só. Elas são muito utilizadas para mexer com grandes volumes de dados que ficam salvos no disco ou em sistemas de bancos de dados modernos, pois como os nós guardam muita informação junta, a árvore fica com poucos níveis de altura e o sistema consegue achar o que quer de forma muito mais rápida.</w:t>
       </w:r>
     </w:p>
     <w:p>

</xml_diff>